<commit_message>
Add writeup template and .gitignore for data files
</commit_message>
<xml_diff>
--- a/Writeup template.docx
+++ b/Writeup template.docx
@@ -613,7 +613,29 @@
         <w:t>Data</w:t>
       </w:r>
     </w:p>
-    <w:p/>
+    <w:p>
+      <w:r>
+        <w:t xml:space="preserve">We decided to merge American-born citizens with those born to American parents abroad into one dummy variable </w:t>
+      </w:r>
+      <w:r>
+        <w:t>since</w:t>
+      </w:r>
+      <w:r>
+        <w:t xml:space="preserve"> </w:t>
+      </w:r>
+      <w:r>
+        <w:t xml:space="preserve">the </w:t>
+      </w:r>
+      <w:r>
+        <w:t>latter category is very scarce (0.66%</w:t>
+      </w:r>
+      <w:r>
+        <w:t xml:space="preserve"> of entries</w:t>
+      </w:r>
+      <w:r>
+        <w:t>).</w:t>
+      </w:r>
+    </w:p>
     <w:p>
       <w:pPr>
         <w:pStyle w:val="Heading1"/>
@@ -622,6 +644,42 @@
         <w:t>Analysis</w:t>
       </w:r>
     </w:p>
+    <w:p/>
+    <w:p>
+      <w:pPr>
+        <w:pStyle w:val="Heading1"/>
+        <w:rPr>
+          <w:sz w:val="28"/>
+          <w:szCs w:val="28"/>
+        </w:rPr>
+      </w:pPr>
+      <w:r>
+        <w:rPr>
+          <w:sz w:val="28"/>
+          <w:szCs w:val="28"/>
+        </w:rPr>
+        <w:t>Initial model</w:t>
+      </w:r>
+    </w:p>
+    <w:p/>
+    <w:p/>
+    <w:p>
+      <w:pPr>
+        <w:pStyle w:val="Heading1"/>
+        <w:rPr>
+          <w:sz w:val="28"/>
+          <w:szCs w:val="28"/>
+        </w:rPr>
+      </w:pPr>
+      <w:r>
+        <w:rPr>
+          <w:sz w:val="28"/>
+          <w:szCs w:val="28"/>
+        </w:rPr>
+        <w:t>Augmented model</w:t>
+      </w:r>
+    </w:p>
+    <w:p/>
     <w:p/>
     <w:p>
       <w:pPr>
@@ -656,6 +714,7 @@
         <w:jc w:val="left"/>
       </w:pPr>
       <w:r>
+        <w:lastRenderedPageBreak/>
         <w:t xml:space="preserve">You may consider using Zotero, a free reference and bibliography software that can be integrated into Word.  </w:t>
       </w:r>
     </w:p>

</xml_diff>